<commit_message>
Met à jour le samedi depuis le nouvel export
Le samedi passe à 156 inscriptions. Les quatre cours du terrain 1
reviennent à Felipe Quesney Andrade, celui de 13 h 30 sur le terrain 4 à
Elias Taieb, et un groupe du terrain 5 est renommé. Les fiches moniteurs
suivent : Mourad Houmid Bennani n'a plus de cours, Felipe entre dans la
liste.

Co-Authored-By: Claude Opus 5 <noreply@anthropic.com>
Claude-Session: https://claude.ai/code/session_01RsDkbcD3KwyPviDTcs72WZ
</commit_message>
<xml_diff>
--- a/Fiche_Elias_Taieb_2026-2027.docx
+++ b/Fiche_Elias_Taieb_2026-2027.docx
@@ -7352,7 +7352,7 @@
                 <w:sz w:val="19"/>
                 <w:szCs w:val="19"/>
               </w:rPr>
-              <w:t xml:space="preserve">4 cours   ·   4,5 h   ·   16 élèves</w:t>
+              <w:t xml:space="preserve">5 cours   ·   6 h   ·   20 élèves</w:t>
             </w:r>
           </w:p>
         </w:tc>
@@ -8585,6 +8585,314 @@
                 <w:szCs w:val="16"/>
               </w:rPr>
               <w:t xml:space="preserve">   2010 · 16.6</w:t>
+            </w:r>
+          </w:p>
+        </w:tc>
+      </w:tr>
+    </w:tbl>
+    <w:p>
+      <w:pPr>
+        <w:spacing w:after="190" w:before="0" w:line="250"/>
+      </w:pPr>
+      <w:r>
+        <w:rPr>
+          <w:rFonts w:ascii="Calibri" w:cs="Calibri" w:eastAsia="Calibri" w:hAnsi="Calibri"/>
+          <w:color w:val="2E2E2E"/>
+          <w:sz w:val="10"/>
+          <w:szCs w:val="10"/>
+        </w:rPr>
+        <w:t xml:space="preserve"/>
+      </w:r>
+    </w:p>
+    <w:tbl>
+      <w:tblPr>
+        <w:tblW w:type="dxa" w:w="9637"/>
+        <w:tblBorders>
+          <w:top w:val="none" w:color="FFFFFF" w:sz="0"/>
+          <w:left w:val="none" w:color="FFFFFF" w:sz="0"/>
+          <w:bottom w:val="none" w:color="FFFFFF" w:sz="0"/>
+          <w:right w:val="none" w:color="FFFFFF" w:sz="0"/>
+          <w:insideH w:val="none" w:color="FFFFFF" w:sz="0"/>
+          <w:insideV w:val="none" w:color="FFFFFF" w:sz="0"/>
+        </w:tblBorders>
+      </w:tblPr>
+      <w:tblGrid>
+        <w:gridCol w:w="9637"/>
+      </w:tblGrid>
+      <w:tr>
+        <w:tc>
+          <w:tcPr>
+            <w:tcW w:type="dxa" w:w="9637"/>
+            <w:shd w:fill="8A9E28" w:color="auto" w:val="clear"/>
+            <w:tcMar>
+              <w:top w:type="dxa" w:w="85"/>
+              <w:left w:type="dxa" w:w="170"/>
+              <w:bottom w:type="dxa" w:w="85"/>
+              <w:right w:type="dxa" w:w="170"/>
+            </w:tcMar>
+            <w:vAlign w:val="center"/>
+          </w:tcPr>
+          <w:p>
+            <w:pPr>
+              <w:spacing w:after="0" w:before="0" w:line="250"/>
+            </w:pPr>
+            <w:r>
+              <w:rPr>
+                <w:rFonts w:ascii="Calibri" w:cs="Calibri" w:eastAsia="Calibri" w:hAnsi="Calibri"/>
+                <w:b/>
+                <w:bCs/>
+                <w:color w:val="FFFFFF"/>
+                <w:sz w:val="22"/>
+                <w:szCs w:val="22"/>
+              </w:rPr>
+              <w:t xml:space="preserve">13:30 – 15:00</w:t>
+            </w:r>
+            <w:r>
+              <w:rPr>
+                <w:rFonts w:ascii="Calibri" w:cs="Calibri" w:eastAsia="Calibri" w:hAnsi="Calibri"/>
+                <w:color w:val="FFFFFF"/>
+                <w:sz w:val="19"/>
+                <w:szCs w:val="19"/>
+              </w:rPr>
+              <w:t xml:space="preserve">      Terrain 4</w:t>
+            </w:r>
+            <w:r>
+              <w:rPr>
+                <w:rFonts w:ascii="Calibri" w:cs="Calibri" w:eastAsia="Calibri" w:hAnsi="Calibri"/>
+                <w:b/>
+                <w:bCs/>
+                <w:color w:val="FFFFFF"/>
+                <w:sz w:val="22"/>
+                <w:szCs w:val="22"/>
+              </w:rPr>
+              <w:t xml:space="preserve">      Rassemblement balles vertes</w:t>
+            </w:r>
+          </w:p>
+        </w:tc>
+      </w:tr>
+    </w:tbl>
+    <w:tbl>
+      <w:tblPr>
+        <w:tblW w:type="dxa" w:w="9637"/>
+        <w:tblBorders>
+          <w:top w:val="none" w:color="FFFFFF" w:sz="0"/>
+          <w:left w:val="none" w:color="FFFFFF" w:sz="0"/>
+          <w:bottom w:val="none" w:color="FFFFFF" w:sz="0"/>
+          <w:right w:val="none" w:color="FFFFFF" w:sz="0"/>
+          <w:insideH w:val="none" w:color="FFFFFF" w:sz="0"/>
+          <w:insideV w:val="none" w:color="FFFFFF" w:sz="0"/>
+        </w:tblBorders>
+      </w:tblPr>
+      <w:tblGrid>
+        <w:gridCol w:w="4818"/>
+        <w:gridCol w:w="4818"/>
+      </w:tblGrid>
+      <w:tr>
+        <w:trPr>
+          <w:trHeight w:val="317" w:hRule="atLeast"/>
+        </w:trPr>
+        <w:tc>
+          <w:tcPr>
+            <w:tcW w:type="dxa" w:w="4818"/>
+            <w:tcBorders>
+              <w:top w:val="none" w:color="FFFFFF" w:sz="0"/>
+              <w:left w:val="none" w:color="FFFFFF" w:sz="0"/>
+              <w:bottom w:val="none" w:color="FFFFFF" w:sz="0"/>
+              <w:right w:val="none" w:color="FFFFFF" w:sz="0"/>
+            </w:tcBorders>
+            <w:tcMar>
+              <w:top w:type="dxa" w:w="34"/>
+              <w:left w:type="dxa" w:w="226"/>
+              <w:bottom w:type="dxa" w:w="34"/>
+              <w:right w:type="dxa" w:w="113"/>
+            </w:tcMar>
+            <w:vAlign w:val="center"/>
+          </w:tcPr>
+          <w:p>
+            <w:pPr>
+              <w:spacing w:after="0" w:before="0" w:line="220"/>
+            </w:pPr>
+            <w:r>
+              <w:rPr>
+                <w:rFonts w:ascii="Calibri" w:cs="Calibri" w:eastAsia="Calibri" w:hAnsi="Calibri"/>
+                <w:color w:val="AAAAAA"/>
+                <w:sz w:val="17"/>
+                <w:szCs w:val="17"/>
+              </w:rPr>
+              <w:t xml:space="preserve">01.  </w:t>
+            </w:r>
+            <w:r>
+              <w:rPr>
+                <w:rFonts w:ascii="Calibri" w:cs="Calibri" w:eastAsia="Calibri" w:hAnsi="Calibri"/>
+                <w:color w:val="2E2E2E"/>
+                <w:sz w:val="19"/>
+                <w:szCs w:val="19"/>
+              </w:rPr>
+              <w:t xml:space="preserve">FUMIATTI Marco</w:t>
+            </w:r>
+            <w:r>
+              <w:rPr>
+                <w:rFonts w:ascii="Calibri" w:cs="Calibri" w:eastAsia="Calibri" w:hAnsi="Calibri"/>
+                <w:color w:val="6E6E6E"/>
+                <w:sz w:val="16"/>
+                <w:szCs w:val="16"/>
+              </w:rPr>
+              <w:t xml:space="preserve">   2016 · 10</w:t>
+            </w:r>
+          </w:p>
+        </w:tc>
+        <w:tc>
+          <w:tcPr>
+            <w:tcW w:type="dxa" w:w="4818"/>
+            <w:tcBorders>
+              <w:top w:val="none" w:color="FFFFFF" w:sz="0"/>
+              <w:left w:val="none" w:color="FFFFFF" w:sz="0"/>
+              <w:bottom w:val="none" w:color="FFFFFF" w:sz="0"/>
+              <w:right w:val="none" w:color="FFFFFF" w:sz="0"/>
+            </w:tcBorders>
+            <w:tcMar>
+              <w:top w:type="dxa" w:w="34"/>
+              <w:left w:type="dxa" w:w="226"/>
+              <w:bottom w:type="dxa" w:w="34"/>
+              <w:right w:type="dxa" w:w="113"/>
+            </w:tcMar>
+            <w:vAlign w:val="center"/>
+          </w:tcPr>
+          <w:p>
+            <w:pPr>
+              <w:spacing w:after="0" w:before="0" w:line="220"/>
+            </w:pPr>
+            <w:r>
+              <w:rPr>
+                <w:rFonts w:ascii="Calibri" w:cs="Calibri" w:eastAsia="Calibri" w:hAnsi="Calibri"/>
+                <w:color w:val="AAAAAA"/>
+                <w:sz w:val="17"/>
+                <w:szCs w:val="17"/>
+              </w:rPr>
+              <w:t xml:space="preserve">03.  </w:t>
+            </w:r>
+            <w:r>
+              <w:rPr>
+                <w:rFonts w:ascii="Calibri" w:cs="Calibri" w:eastAsia="Calibri" w:hAnsi="Calibri"/>
+                <w:color w:val="2E2E2E"/>
+                <w:sz w:val="19"/>
+                <w:szCs w:val="19"/>
+              </w:rPr>
+              <w:t xml:space="preserve">MOUTON Florentin</w:t>
+            </w:r>
+            <w:r>
+              <w:rPr>
+                <w:rFonts w:ascii="Calibri" w:cs="Calibri" w:eastAsia="Calibri" w:hAnsi="Calibri"/>
+                <w:color w:val="6E6E6E"/>
+                <w:sz w:val="16"/>
+                <w:szCs w:val="16"/>
+              </w:rPr>
+              <w:t xml:space="preserve">   2016 · 10.5</w:t>
+            </w:r>
+          </w:p>
+        </w:tc>
+      </w:tr>
+      <w:tr>
+        <w:trPr>
+          <w:trHeight w:val="317" w:hRule="atLeast"/>
+        </w:trPr>
+        <w:tc>
+          <w:tcPr>
+            <w:tcW w:type="dxa" w:w="4818"/>
+            <w:tcBorders>
+              <w:top w:val="none" w:color="FFFFFF" w:sz="0"/>
+              <w:left w:val="none" w:color="FFFFFF" w:sz="0"/>
+              <w:bottom w:val="none" w:color="FFFFFF" w:sz="0"/>
+              <w:right w:val="none" w:color="FFFFFF" w:sz="0"/>
+            </w:tcBorders>
+            <w:tcMar>
+              <w:top w:type="dxa" w:w="34"/>
+              <w:left w:type="dxa" w:w="226"/>
+              <w:bottom w:type="dxa" w:w="34"/>
+              <w:right w:type="dxa" w:w="113"/>
+            </w:tcMar>
+            <w:vAlign w:val="center"/>
+          </w:tcPr>
+          <w:p>
+            <w:pPr>
+              <w:spacing w:after="0" w:before="0" w:line="220"/>
+            </w:pPr>
+            <w:r>
+              <w:rPr>
+                <w:rFonts w:ascii="Calibri" w:cs="Calibri" w:eastAsia="Calibri" w:hAnsi="Calibri"/>
+                <w:color w:val="AAAAAA"/>
+                <w:sz w:val="17"/>
+                <w:szCs w:val="17"/>
+              </w:rPr>
+              <w:t xml:space="preserve">02.  </w:t>
+            </w:r>
+            <w:r>
+              <w:rPr>
+                <w:rFonts w:ascii="Calibri" w:cs="Calibri" w:eastAsia="Calibri" w:hAnsi="Calibri"/>
+                <w:color w:val="2E2E2E"/>
+                <w:sz w:val="19"/>
+                <w:szCs w:val="19"/>
+              </w:rPr>
+              <w:t xml:space="preserve">LUKACHI Vladimir</w:t>
+            </w:r>
+            <w:r>
+              <w:rPr>
+                <w:rFonts w:ascii="Calibri" w:cs="Calibri" w:eastAsia="Calibri" w:hAnsi="Calibri"/>
+                <w:color w:val="6E6E6E"/>
+                <w:sz w:val="16"/>
+                <w:szCs w:val="16"/>
+              </w:rPr>
+              <w:t xml:space="preserve">   2016 · 10.4</w:t>
+            </w:r>
+          </w:p>
+        </w:tc>
+        <w:tc>
+          <w:tcPr>
+            <w:tcW w:type="dxa" w:w="4818"/>
+            <w:tcBorders>
+              <w:top w:val="none" w:color="FFFFFF" w:sz="0"/>
+              <w:left w:val="none" w:color="FFFFFF" w:sz="0"/>
+              <w:bottom w:val="none" w:color="FFFFFF" w:sz="0"/>
+              <w:right w:val="none" w:color="FFFFFF" w:sz="0"/>
+            </w:tcBorders>
+            <w:tcMar>
+              <w:top w:type="dxa" w:w="34"/>
+              <w:left w:type="dxa" w:w="226"/>
+              <w:bottom w:type="dxa" w:w="34"/>
+              <w:right w:type="dxa" w:w="113"/>
+            </w:tcMar>
+            <w:vAlign w:val="center"/>
+          </w:tcPr>
+          <w:p>
+            <w:pPr>
+              <w:spacing w:after="0" w:before="0" w:line="220"/>
+            </w:pPr>
+            <w:r>
+              <w:rPr>
+                <w:rFonts w:ascii="Calibri" w:cs="Calibri" w:eastAsia="Calibri" w:hAnsi="Calibri"/>
+                <w:color w:val="AAAAAA"/>
+                <w:sz w:val="17"/>
+                <w:szCs w:val="17"/>
+              </w:rPr>
+              <w:t xml:space="preserve">04.  </w:t>
+            </w:r>
+            <w:r>
+              <w:rPr>
+                <w:rFonts w:ascii="Calibri" w:cs="Calibri" w:eastAsia="Calibri" w:hAnsi="Calibri"/>
+                <w:color w:val="2E2E2E"/>
+                <w:sz w:val="19"/>
+                <w:szCs w:val="19"/>
+              </w:rPr>
+              <w:t xml:space="preserve">NOGUÈS Matthis</w:t>
+            </w:r>
+            <w:r>
+              <w:rPr>
+                <w:rFonts w:ascii="Calibri" w:cs="Calibri" w:eastAsia="Calibri" w:hAnsi="Calibri"/>
+                <w:color w:val="6E6E6E"/>
+                <w:sz w:val="16"/>
+                <w:szCs w:val="16"/>
+              </w:rPr>
+              <w:t xml:space="preserve">   2016 · 10</w:t>
             </w:r>
           </w:p>
         </w:tc>
@@ -8672,7 +8980,7 @@
         <w:sz w:val="15"/>
         <w:szCs w:val="15"/>
       </w:rPr>
-      <w:t xml:space="preserve">Elias Taieb  ·  24 cours  ·  27 h par semaine  ·  Saison 2026-2027</w:t>
+      <w:t xml:space="preserve">Elias Taieb  ·  25 cours  ·  28,5 h par semaine  ·  Saison 2026-2027</w:t>
     </w:r>
   </w:p>
 </w:ftr>

</xml_diff>

<commit_message>
Met à jour le planning du jeudi (export semaine 1)
20 cours, 62 inscriptions, aucun cours ajouté ni supprimé, aucun
changement de moniteur. Un seul mouvement : LUMBU Elisabeth quitte
« Jaune » (18:00, Terrain 2).

Six fiches moniteurs sont régénérées en conséquence.

Co-Authored-By: Claude Opus 5 <noreply@anthropic.com>
Claude-Session: https://claude.ai/code/session_01RsDkbcD3KwyPviDTcs72WZ
</commit_message>
<xml_diff>
--- a/Fiche_Elias_Taieb_2026-2027.docx
+++ b/Fiche_Elias_Taieb_2026-2027.docx
@@ -4170,7 +4170,7 @@
                 <w:sz w:val="19"/>
                 <w:szCs w:val="19"/>
               </w:rPr>
-              <w:t xml:space="preserve">5 cours   ·   5,5 h   ·   16 élèves</w:t>
+              <w:t xml:space="preserve">5 cours   ·   5,5 h   ·   15 élèves</w:t>
             </w:r>
           </w:p>
         </w:tc>
@@ -4428,7 +4428,7 @@
                 <w:sz w:val="16"/>
                 <w:szCs w:val="16"/>
               </w:rPr>
-              <w:t xml:space="preserve">   1978 · 48.5</w:t>
+              <w:t xml:space="preserve">   1978 · 48.6</w:t>
             </w:r>
           </w:p>
         </w:tc>
@@ -4816,7 +4816,7 @@
                 <w:sz w:val="16"/>
                 <w:szCs w:val="16"/>
               </w:rPr>
-              <w:t xml:space="preserve">   2012 · 14.3</w:t>
+              <w:t xml:space="preserve">   2012 · 14.4</w:t>
             </w:r>
           </w:p>
         </w:tc>
@@ -4866,7 +4866,7 @@
                 <w:sz w:val="16"/>
                 <w:szCs w:val="16"/>
               </w:rPr>
-              <w:t xml:space="preserve">   2012 · 13.7</w:t>
+              <w:t xml:space="preserve">   2012 · 13.8</w:t>
             </w:r>
           </w:p>
         </w:tc>
@@ -5147,7 +5147,7 @@
                 <w:sz w:val="19"/>
                 <w:szCs w:val="19"/>
               </w:rPr>
-              <w:t xml:space="preserve">TONA Eliana</w:t>
+              <w:t xml:space="preserve">UGURLU Nil</w:t>
             </w:r>
             <w:r>
               <w:rPr>
@@ -5156,7 +5156,7 @@
                 <w:sz w:val="16"/>
                 <w:szCs w:val="16"/>
               </w:rPr>
-              <w:t xml:space="preserve">   2010 · 16.6</w:t>
+              <w:t xml:space="preserve">   2009 · 17.3</w:t>
             </w:r>
           </w:p>
         </w:tc>
@@ -5202,7 +5202,7 @@
                 <w:sz w:val="19"/>
                 <w:szCs w:val="19"/>
               </w:rPr>
-              <w:t xml:space="preserve">LUMBU Elisabeth</w:t>
+              <w:t xml:space="preserve">TONA Eliana</w:t>
             </w:r>
             <w:r>
               <w:rPr>
@@ -5211,57 +5211,39 @@
                 <w:sz w:val="16"/>
                 <w:szCs w:val="16"/>
               </w:rPr>
-              <w:t xml:space="preserve">   2010 · 16.2</w:t>
-            </w:r>
-          </w:p>
-        </w:tc>
-        <w:tc>
-          <w:tcPr>
-            <w:tcW w:type="dxa" w:w="4818"/>
-            <w:tcBorders>
-              <w:top w:val="none" w:color="FFFFFF" w:sz="0"/>
-              <w:left w:val="none" w:color="FFFFFF" w:sz="0"/>
-              <w:bottom w:val="none" w:color="FFFFFF" w:sz="0"/>
-              <w:right w:val="none" w:color="FFFFFF" w:sz="0"/>
-            </w:tcBorders>
-            <w:tcMar>
-              <w:top w:type="dxa" w:w="34"/>
-              <w:left w:type="dxa" w:w="226"/>
-              <w:bottom w:type="dxa" w:w="34"/>
-              <w:right w:type="dxa" w:w="113"/>
-            </w:tcMar>
-            <w:vAlign w:val="center"/>
-          </w:tcPr>
-          <w:p>
-            <w:pPr>
-              <w:spacing w:after="0" w:before="0" w:line="220"/>
-            </w:pPr>
-            <w:r>
-              <w:rPr>
-                <w:rFonts w:ascii="Calibri" w:cs="Calibri" w:eastAsia="Calibri" w:hAnsi="Calibri"/>
-                <w:color w:val="AAAAAA"/>
-                <w:sz w:val="17"/>
-                <w:szCs w:val="17"/>
-              </w:rPr>
-              <w:t xml:space="preserve">04.  </w:t>
-            </w:r>
-            <w:r>
-              <w:rPr>
-                <w:rFonts w:ascii="Calibri" w:cs="Calibri" w:eastAsia="Calibri" w:hAnsi="Calibri"/>
-                <w:color w:val="2E2E2E"/>
-                <w:sz w:val="19"/>
-                <w:szCs w:val="19"/>
-              </w:rPr>
-              <w:t xml:space="preserve">UGURLU Nil</w:t>
-            </w:r>
-            <w:r>
-              <w:rPr>
-                <w:rFonts w:ascii="Calibri" w:cs="Calibri" w:eastAsia="Calibri" w:hAnsi="Calibri"/>
-                <w:color w:val="6E6E6E"/>
-                <w:sz w:val="16"/>
-                <w:szCs w:val="16"/>
-              </w:rPr>
-              <w:t xml:space="preserve">   2009 · 17.3</w:t>
+              <w:t xml:space="preserve">   2010 · 16.6</w:t>
+            </w:r>
+          </w:p>
+        </w:tc>
+        <w:tc>
+          <w:tcPr>
+            <w:tcW w:type="dxa" w:w="4818"/>
+            <w:tcBorders>
+              <w:top w:val="none" w:color="FFFFFF" w:sz="0"/>
+              <w:left w:val="none" w:color="FFFFFF" w:sz="0"/>
+              <w:bottom w:val="none" w:color="FFFFFF" w:sz="0"/>
+              <w:right w:val="none" w:color="FFFFFF" w:sz="0"/>
+            </w:tcBorders>
+            <w:tcMar>
+              <w:top w:type="dxa" w:w="34"/>
+              <w:left w:type="dxa" w:w="226"/>
+              <w:bottom w:type="dxa" w:w="34"/>
+              <w:right w:type="dxa" w:w="113"/>
+            </w:tcMar>
+            <w:vAlign w:val="center"/>
+          </w:tcPr>
+          <w:p>
+            <w:pPr>
+              <w:spacing w:after="0" w:before="0" w:line="220"/>
+            </w:pPr>
+            <w:r>
+              <w:rPr>
+                <w:rFonts w:ascii="Calibri" w:cs="Calibri" w:eastAsia="Calibri" w:hAnsi="Calibri"/>
+                <w:color w:val="2E2E2E"/>
+                <w:sz w:val="14"/>
+                <w:szCs w:val="14"/>
+              </w:rPr>
+              <w:t xml:space="preserve"/>
             </w:r>
           </w:p>
         </w:tc>

</xml_diff>

<commit_message>
Met à jour le planning du vendredi (export semaine 1)
30 cours (un de moins), 91 inscriptions. Le « Jaune ados » de 20:30 qui
n'avait pas de moniteur a disparu ; l'« Adultes Compet » de Julien
Chibli occupe désormais le Terrain 3 à sa place, et le Terrain 4 se
libère à cette heure-là. Quatre élèves s'ajoutent par ailleurs : un dans
chacun des trois Rassemblements de 19:00 et VAN GELDEREN Sophie dans
l'« Adultes » de 20:30.

Sept fiches moniteurs sont régénérées en conséquence.

Co-Authored-By: Claude Opus 5 <noreply@anthropic.com>
Claude-Session: https://claude.ai/code/session_01RsDkbcD3KwyPviDTcs72WZ
</commit_message>
<xml_diff>
--- a/Fiche_Elias_Taieb_2026-2027.docx
+++ b/Fiche_Elias_Taieb_2026-2027.docx
@@ -5936,7 +5936,7 @@
                 <w:sz w:val="16"/>
                 <w:szCs w:val="16"/>
               </w:rPr>
-              <w:t xml:space="preserve">   1962 · 64</w:t>
+              <w:t xml:space="preserve">   1962 · 64.1</w:t>
             </w:r>
           </w:p>
         </w:tc>
@@ -6091,7 +6091,7 @@
                 <w:sz w:val="16"/>
                 <w:szCs w:val="16"/>
               </w:rPr>
-              <w:t xml:space="preserve">   1981 · 44.7</w:t>
+              <w:t xml:space="preserve">   1981 · 44.8</w:t>
             </w:r>
           </w:p>
         </w:tc>
@@ -6657,7 +6657,7 @@
                 <w:sz w:val="16"/>
                 <w:szCs w:val="16"/>
               </w:rPr>
-              <w:t xml:space="preserve">   2016 · 10.1</w:t>
+              <w:t xml:space="preserve">   2016 · 10.2</w:t>
             </w:r>
           </w:p>
         </w:tc>
@@ -6860,7 +6860,7 @@
                 <w:sz w:val="16"/>
                 <w:szCs w:val="16"/>
               </w:rPr>
-              <w:t xml:space="preserve">   1974 · 52.3</w:t>
+              <w:t xml:space="preserve">   1974 · 52.4</w:t>
             </w:r>
           </w:p>
         </w:tc>
@@ -7015,7 +7015,7 @@
                 <w:sz w:val="16"/>
                 <w:szCs w:val="16"/>
               </w:rPr>
-              <w:t xml:space="preserve">   1979 · 47.3</w:t>
+              <w:t xml:space="preserve">   1979 · 47.4</w:t>
             </w:r>
           </w:p>
         </w:tc>

</xml_diff>